<commit_message>
docs: record the Indian-titles taste rule in README and the project memory
Indian titles are marked Not interested because of their country of origin,
not their story, genre, director, or cast. The memory document also gets the
Arabic Read Aloud fixes (ar-SA, bidi paragraphs, compatibility mode 15).

Co-Authored-By: Claude Opus 5.5 <noreply@anthropic.com>
Claude-Session: https://claude.ai/code/session_017e1LCJrJMzsnt6gAKALy73
</commit_message>
<xml_diff>
--- a/data/الذاكرة السينمائية.docx
+++ b/data/الذاكرة السينمائية.docx
@@ -5,6 +5,7 @@
     <w:p>
       <w:pPr>
         <w:spacing w:after="240"/>
+        <w:bidi/>
         <w:jc w:val="center"/>
       </w:pPr>
       <w:r>
@@ -20,7 +21,6 @@
     <w:p>
       <w:pPr>
         <w:spacing w:after="70" w:line="276" w:lineRule="auto"/>
-        <w:jc w:val="right"/>
         <w:bidi/>
       </w:pPr>
       <w:r>
@@ -28,13 +28,12 @@
           <w:rFonts w:ascii="Arial" w:hAnsi="Arial" w:cs="Arial"/>
           <w:sz w:val="23"/>
         </w:rPr>
-        <w:t>آخر تحديث: 14 يوليو 2026</w:t>
+        <w:t>آخر تحديث: 19 أكتوبر 2026</w:t>
       </w:r>
     </w:p>
     <w:p>
       <w:pPr>
         <w:spacing w:after="70" w:line="276" w:lineRule="auto"/>
-        <w:jc w:val="right"/>
         <w:bidi/>
       </w:pPr>
       <w:r>
@@ -48,7 +47,6 @@
     <w:p>
       <w:pPr>
         <w:spacing w:after="70" w:line="276" w:lineRule="auto"/>
-        <w:jc w:val="right"/>
         <w:bidi/>
       </w:pPr>
       <w:r>
@@ -62,7 +60,6 @@
     <w:p>
       <w:pPr>
         <w:spacing w:before="160" w:after="80"/>
-        <w:jc w:val="right"/>
         <w:bidi/>
       </w:pPr>
       <w:r>
@@ -78,7 +75,6 @@
     <w:p>
       <w:pPr>
         <w:spacing w:after="70" w:line="276" w:lineRule="auto"/>
-        <w:jc w:val="right"/>
         <w:bidi/>
       </w:pPr>
       <w:r>
@@ -92,7 +88,6 @@
     <w:p>
       <w:pPr>
         <w:spacing w:before="160" w:after="80"/>
-        <w:jc w:val="right"/>
         <w:bidi/>
       </w:pPr>
       <w:r>
@@ -108,7 +103,6 @@
     <w:p>
       <w:pPr>
         <w:spacing w:before="100" w:after="60"/>
-        <w:jc w:val="right"/>
         <w:bidi/>
       </w:pPr>
       <w:r>
@@ -125,7 +119,6 @@
       <w:pPr>
         <w:pStyle w:val="ListBullet"/>
         <w:spacing w:after="70" w:line="276" w:lineRule="auto"/>
-        <w:jc w:val="right"/>
         <w:bidi/>
       </w:pPr>
       <w:r>
@@ -140,7 +133,6 @@
       <w:pPr>
         <w:pStyle w:val="ListBullet"/>
         <w:spacing w:after="70" w:line="276" w:lineRule="auto"/>
-        <w:jc w:val="right"/>
         <w:bidi/>
       </w:pPr>
       <w:r>
@@ -155,7 +147,6 @@
       <w:pPr>
         <w:pStyle w:val="ListBullet"/>
         <w:spacing w:after="70" w:line="276" w:lineRule="auto"/>
-        <w:jc w:val="right"/>
         <w:bidi/>
       </w:pPr>
       <w:r>
@@ -170,7 +161,6 @@
       <w:pPr>
         <w:pStyle w:val="ListBullet"/>
         <w:spacing w:after="70" w:line="276" w:lineRule="auto"/>
-        <w:jc w:val="right"/>
         <w:bidi/>
       </w:pPr>
       <w:r>
@@ -185,7 +175,6 @@
       <w:pPr>
         <w:pStyle w:val="ListBullet"/>
         <w:spacing w:after="70" w:line="276" w:lineRule="auto"/>
-        <w:jc w:val="right"/>
         <w:bidi/>
       </w:pPr>
       <w:r>
@@ -200,7 +189,6 @@
       <w:pPr>
         <w:pStyle w:val="ListBullet"/>
         <w:spacing w:after="70" w:line="276" w:lineRule="auto"/>
-        <w:jc w:val="right"/>
         <w:bidi/>
       </w:pPr>
       <w:r>
@@ -214,7 +202,6 @@
     <w:p>
       <w:pPr>
         <w:spacing w:before="100" w:after="60"/>
-        <w:jc w:val="right"/>
         <w:bidi/>
       </w:pPr>
       <w:r>
@@ -231,7 +218,6 @@
       <w:pPr>
         <w:pStyle w:val="ListBullet"/>
         <w:spacing w:after="70" w:line="276" w:lineRule="auto"/>
-        <w:jc w:val="right"/>
         <w:bidi/>
       </w:pPr>
       <w:r>
@@ -246,7 +232,6 @@
       <w:pPr>
         <w:pStyle w:val="ListBullet"/>
         <w:spacing w:after="70" w:line="276" w:lineRule="auto"/>
-        <w:jc w:val="right"/>
         <w:bidi/>
       </w:pPr>
       <w:r>
@@ -261,7 +246,6 @@
       <w:pPr>
         <w:pStyle w:val="ListBullet"/>
         <w:spacing w:after="70" w:line="276" w:lineRule="auto"/>
-        <w:jc w:val="right"/>
         <w:bidi/>
       </w:pPr>
       <w:r>
@@ -276,7 +260,6 @@
       <w:pPr>
         <w:pStyle w:val="ListBullet"/>
         <w:spacing w:after="70" w:line="276" w:lineRule="auto"/>
-        <w:jc w:val="right"/>
         <w:bidi/>
       </w:pPr>
       <w:r>
@@ -291,7 +274,6 @@
       <w:pPr>
         <w:pStyle w:val="ListBullet"/>
         <w:spacing w:after="70" w:line="276" w:lineRule="auto"/>
-        <w:jc w:val="right"/>
         <w:bidi/>
       </w:pPr>
       <w:r>
@@ -305,7 +287,6 @@
     <w:p>
       <w:pPr>
         <w:spacing w:before="100" w:after="60"/>
-        <w:jc w:val="right"/>
         <w:bidi/>
       </w:pPr>
       <w:r>
@@ -322,7 +303,6 @@
       <w:pPr>
         <w:pStyle w:val="ListBullet"/>
         <w:spacing w:after="70" w:line="276" w:lineRule="auto"/>
-        <w:jc w:val="right"/>
         <w:bidi/>
       </w:pPr>
       <w:r>
@@ -337,7 +317,6 @@
       <w:pPr>
         <w:pStyle w:val="ListBullet"/>
         <w:spacing w:after="70" w:line="276" w:lineRule="auto"/>
-        <w:jc w:val="right"/>
         <w:bidi/>
       </w:pPr>
       <w:r>
@@ -352,7 +331,6 @@
       <w:pPr>
         <w:pStyle w:val="ListBullet"/>
         <w:spacing w:after="70" w:line="276" w:lineRule="auto"/>
-        <w:jc w:val="right"/>
         <w:bidi/>
       </w:pPr>
       <w:r>
@@ -367,7 +345,6 @@
       <w:pPr>
         <w:pStyle w:val="ListBullet"/>
         <w:spacing w:after="70" w:line="276" w:lineRule="auto"/>
-        <w:jc w:val="right"/>
         <w:bidi/>
       </w:pPr>
       <w:r>
@@ -382,7 +359,6 @@
       <w:pPr>
         <w:pStyle w:val="ListBullet"/>
         <w:spacing w:after="70" w:line="276" w:lineRule="auto"/>
-        <w:jc w:val="right"/>
         <w:bidi/>
       </w:pPr>
       <w:r>
@@ -396,7 +372,6 @@
     <w:p>
       <w:pPr>
         <w:spacing w:before="160" w:after="80"/>
-        <w:jc w:val="right"/>
         <w:bidi/>
       </w:pPr>
       <w:r>
@@ -413,7 +388,6 @@
       <w:pPr>
         <w:pStyle w:val="ListBullet"/>
         <w:spacing w:after="70" w:line="276" w:lineRule="auto"/>
-        <w:jc w:val="right"/>
         <w:bidi/>
       </w:pPr>
       <w:r>
@@ -428,7 +402,6 @@
       <w:pPr>
         <w:pStyle w:val="ListBullet"/>
         <w:spacing w:after="70" w:line="276" w:lineRule="auto"/>
-        <w:jc w:val="right"/>
         <w:bidi/>
       </w:pPr>
       <w:r>
@@ -443,7 +416,6 @@
       <w:pPr>
         <w:pStyle w:val="ListBullet"/>
         <w:spacing w:after="70" w:line="276" w:lineRule="auto"/>
-        <w:jc w:val="right"/>
         <w:bidi/>
       </w:pPr>
       <w:r>
@@ -458,7 +430,6 @@
       <w:pPr>
         <w:pStyle w:val="ListBullet"/>
         <w:spacing w:after="70" w:line="276" w:lineRule="auto"/>
-        <w:jc w:val="right"/>
         <w:bidi/>
       </w:pPr>
       <w:r>
@@ -473,7 +444,6 @@
       <w:pPr>
         <w:pStyle w:val="ListBullet"/>
         <w:spacing w:after="70" w:line="276" w:lineRule="auto"/>
-        <w:jc w:val="right"/>
         <w:bidi/>
       </w:pPr>
       <w:r>
@@ -488,7 +458,6 @@
       <w:pPr>
         <w:pStyle w:val="ListBullet"/>
         <w:spacing w:after="70" w:line="276" w:lineRule="auto"/>
-        <w:jc w:val="right"/>
         <w:bidi/>
       </w:pPr>
       <w:r>
@@ -503,7 +472,6 @@
       <w:pPr>
         <w:pStyle w:val="ListBullet"/>
         <w:spacing w:after="70" w:line="276" w:lineRule="auto"/>
-        <w:jc w:val="right"/>
         <w:bidi/>
       </w:pPr>
       <w:r>
@@ -517,7 +485,106 @@
     <w:p>
       <w:pPr>
         <w:spacing w:before="160" w:after="80"/>
-        <w:jc w:val="right"/>
+        <w:bidi/>
+      </w:pPr>
+      <w:r>
+        <w:rPr>
+          <w:rFonts w:ascii="Arial" w:hAnsi="Arial" w:cs="Arial"/>
+          <w:b/>
+          <w:color w:val="7A4327"/>
+          <w:sz w:val="30"/>
+        </w:rPr>
+        <w:t>قواعد الذائقة الثابتة</w:t>
+      </w:r>
+    </w:p>
+    <w:p>
+      <w:pPr>
+        <w:spacing w:before="100" w:after="60"/>
+        <w:bidi/>
+      </w:pPr>
+      <w:r>
+        <w:rPr>
+          <w:rFonts w:ascii="Arial" w:hAnsi="Arial" w:cs="Arial"/>
+          <w:b/>
+          <w:color w:val="9A622F"/>
+          <w:sz w:val="26"/>
+        </w:rPr>
+        <w:t>قاعدة الأعمال الهندية — 19 أكتوبر 2026</w:t>
+      </w:r>
+    </w:p>
+    <w:p>
+      <w:pPr>
+        <w:pStyle w:val="ListBullet"/>
+        <w:spacing w:after="70" w:line="276" w:lineRule="auto"/>
+        <w:bidi/>
+      </w:pPr>
+      <w:r>
+        <w:rPr>
+          <w:rFonts w:ascii="Arial" w:hAnsi="Arial" w:cs="Arial"/>
+          <w:sz w:val="23"/>
+        </w:rPr>
+        <w:t xml:space="preserve">كل الأعمال الهندية معلَّمة بـ «لا يهمني» في «رصد الذائقة»، والسبب أن المستخدم لا يحب السينما الهندية ولا تستهويه عمومًا.</w:t>
+      </w:r>
+    </w:p>
+    <w:p>
+      <w:pPr>
+        <w:pStyle w:val="ListBullet"/>
+        <w:spacing w:after="70" w:line="276" w:lineRule="auto"/>
+        <w:bidi/>
+      </w:pPr>
+      <w:r>
+        <w:rPr>
+          <w:rFonts w:ascii="Arial" w:hAnsi="Arial" w:cs="Arial"/>
+          <w:sz w:val="23"/>
+        </w:rPr>
+        <w:t xml:space="preserve">هذه العلامة تفضيل يخص بلد المنشأ وحده، ولا علاقة لها بقصة العمل أو نوعه أو موضوعه أو مخرجه أو ممثليه أو كتّابه.</w:t>
+      </w:r>
+    </w:p>
+    <w:p>
+      <w:pPr>
+        <w:pStyle w:val="ListBullet"/>
+        <w:spacing w:after="70" w:line="276" w:lineRule="auto"/>
+        <w:bidi/>
+      </w:pPr>
+      <w:r>
+        <w:rPr>
+          <w:rFonts w:ascii="Arial" w:hAnsi="Arial" w:cs="Arial"/>
+          <w:sz w:val="23"/>
+        </w:rPr>
+        <w:t xml:space="preserve">لا تُحتسب هذه العلامات إشارة سلبية على أي نوع سينمائي أو موضوع أو اسم، ولا تُخفض وزن مخرج أو ممثل يظهر أيضًا في أعمال غير هندية.</w:t>
+      </w:r>
+    </w:p>
+    <w:p>
+      <w:pPr>
+        <w:pStyle w:val="ListBullet"/>
+        <w:spacing w:after="70" w:line="276" w:lineRule="auto"/>
+        <w:bidi/>
+      </w:pPr>
+      <w:r>
+        <w:rPr>
+          <w:rFonts w:ascii="Arial" w:hAnsi="Arial" w:cs="Arial"/>
+          <w:sz w:val="23"/>
+        </w:rPr>
+        <w:t xml:space="preserve">أي عمل هندي يُطرح لاحقًا يُستبعد مباشرة بسبب منشئه، دون تحليل ذائقي لمحتواه.</w:t>
+      </w:r>
+    </w:p>
+    <w:p>
+      <w:pPr>
+        <w:pStyle w:val="ListBullet"/>
+        <w:spacing w:after="70" w:line="276" w:lineRule="auto"/>
+        <w:bidi/>
+      </w:pPr>
+      <w:r>
+        <w:rPr>
+          <w:rFonts w:ascii="Arial" w:hAnsi="Arial" w:cs="Arial"/>
+          <w:sz w:val="23"/>
+        </w:rPr>
+        <w:t xml:space="preserve">إذا ظهر عمل هندي في قائمة «أعجبتني» فهو استثناء يُسأل عنه المستخدم قبل البناء عليه.</w:t>
+      </w:r>
+    </w:p>
+    <w:p>
+      <w:pPr>
+        <w:spacing w:before="160" w:after="80"/>
         <w:bidi/>
       </w:pPr>
       <w:r>
@@ -533,6 +600,7 @@
     <w:p>
       <w:pPr>
         <w:spacing w:after="240"/>
+        <w:bidi/>
         <w:jc w:val="center"/>
       </w:pPr>
       <w:r>
@@ -548,7 +616,6 @@
     <w:p>
       <w:pPr>
         <w:spacing w:after="70" w:line="276" w:lineRule="auto"/>
-        <w:jc w:val="right"/>
         <w:bidi/>
       </w:pPr>
       <w:r>
@@ -562,7 +629,6 @@
     <w:p>
       <w:pPr>
         <w:spacing w:after="70" w:line="276" w:lineRule="auto"/>
-        <w:jc w:val="right"/>
         <w:bidi/>
       </w:pPr>
       <w:r>
@@ -576,7 +642,6 @@
     <w:p>
       <w:pPr>
         <w:spacing w:after="70" w:line="276" w:lineRule="auto"/>
-        <w:jc w:val="right"/>
         <w:bidi/>
       </w:pPr>
       <w:r>
@@ -590,7 +655,6 @@
     <w:p>
       <w:pPr>
         <w:spacing w:after="70" w:line="276" w:lineRule="auto"/>
-        <w:jc w:val="right"/>
         <w:bidi/>
       </w:pPr>
       <w:r>
@@ -604,7 +668,6 @@
     <w:p>
       <w:pPr>
         <w:spacing w:after="70" w:line="276" w:lineRule="auto"/>
-        <w:jc w:val="right"/>
         <w:bidi/>
       </w:pPr>
       <w:r>
@@ -618,7 +681,6 @@
     <w:p>
       <w:pPr>
         <w:spacing w:before="160" w:after="80"/>
-        <w:jc w:val="right"/>
         <w:bidi/>
       </w:pPr>
       <w:r>
@@ -635,7 +697,6 @@
       <w:pPr>
         <w:pStyle w:val="ListBullet"/>
         <w:spacing w:after="70" w:line="276" w:lineRule="auto"/>
-        <w:jc w:val="right"/>
         <w:bidi/>
       </w:pPr>
       <w:r>
@@ -650,7 +711,6 @@
       <w:pPr>
         <w:pStyle w:val="ListBullet"/>
         <w:spacing w:after="70" w:line="276" w:lineRule="auto"/>
-        <w:jc w:val="right"/>
         <w:bidi/>
       </w:pPr>
       <w:r>
@@ -665,7 +725,6 @@
       <w:pPr>
         <w:pStyle w:val="ListBullet"/>
         <w:spacing w:after="70" w:line="276" w:lineRule="auto"/>
-        <w:jc w:val="right"/>
         <w:bidi/>
       </w:pPr>
       <w:r>
@@ -680,7 +739,6 @@
       <w:pPr>
         <w:pStyle w:val="ListBullet"/>
         <w:spacing w:after="70" w:line="276" w:lineRule="auto"/>
-        <w:jc w:val="right"/>
         <w:bidi/>
       </w:pPr>
       <w:r>
@@ -694,7 +752,6 @@
     <w:p>
       <w:pPr>
         <w:spacing w:before="160" w:after="80"/>
-        <w:jc w:val="right"/>
         <w:bidi/>
       </w:pPr>
       <w:r>
@@ -710,7 +767,6 @@
     <w:p>
       <w:pPr>
         <w:spacing w:after="70" w:line="276" w:lineRule="auto"/>
-        <w:jc w:val="right"/>
         <w:bidi/>
       </w:pPr>
       <w:r>
@@ -725,7 +781,6 @@
       <w:pPr>
         <w:pStyle w:val="ListBullet"/>
         <w:spacing w:after="70" w:line="276" w:lineRule="auto"/>
-        <w:jc w:val="right"/>
         <w:bidi/>
       </w:pPr>
       <w:r>
@@ -740,7 +795,6 @@
       <w:pPr>
         <w:pStyle w:val="ListBullet"/>
         <w:spacing w:after="70" w:line="276" w:lineRule="auto"/>
-        <w:jc w:val="right"/>
         <w:bidi/>
       </w:pPr>
       <w:r>
@@ -755,7 +809,6 @@
       <w:pPr>
         <w:pStyle w:val="ListBullet"/>
         <w:spacing w:after="70" w:line="276" w:lineRule="auto"/>
-        <w:jc w:val="right"/>
         <w:bidi/>
       </w:pPr>
       <w:r>
@@ -770,7 +823,6 @@
       <w:pPr>
         <w:pStyle w:val="ListBullet"/>
         <w:spacing w:after="70" w:line="276" w:lineRule="auto"/>
-        <w:jc w:val="right"/>
         <w:bidi/>
       </w:pPr>
       <w:r>
@@ -785,7 +837,6 @@
       <w:pPr>
         <w:pStyle w:val="ListBullet"/>
         <w:spacing w:after="70" w:line="276" w:lineRule="auto"/>
-        <w:jc w:val="right"/>
         <w:bidi/>
       </w:pPr>
       <w:r>
@@ -800,7 +851,6 @@
       <w:pPr>
         <w:pStyle w:val="ListBullet"/>
         <w:spacing w:after="70" w:line="276" w:lineRule="auto"/>
-        <w:jc w:val="right"/>
         <w:bidi/>
       </w:pPr>
       <w:r>
@@ -814,7 +864,6 @@
     <w:p>
       <w:pPr>
         <w:spacing w:after="70" w:line="276" w:lineRule="auto"/>
-        <w:jc w:val="right"/>
         <w:bidi/>
       </w:pPr>
       <w:r>
@@ -828,7 +877,6 @@
     <w:p>
       <w:pPr>
         <w:spacing w:before="160" w:after="80"/>
-        <w:jc w:val="right"/>
         <w:bidi/>
       </w:pPr>
       <w:r>
@@ -845,7 +893,6 @@
       <w:pPr>
         <w:pStyle w:val="ListBullet"/>
         <w:spacing w:after="70" w:line="276" w:lineRule="auto"/>
-        <w:jc w:val="right"/>
         <w:bidi/>
       </w:pPr>
       <w:r>
@@ -860,7 +907,6 @@
       <w:pPr>
         <w:pStyle w:val="ListBullet"/>
         <w:spacing w:after="70" w:line="276" w:lineRule="auto"/>
-        <w:jc w:val="right"/>
         <w:bidi/>
       </w:pPr>
       <w:r>
@@ -875,7 +921,6 @@
       <w:pPr>
         <w:pStyle w:val="ListBullet"/>
         <w:spacing w:after="70" w:line="276" w:lineRule="auto"/>
-        <w:jc w:val="right"/>
         <w:bidi/>
       </w:pPr>
       <w:r>
@@ -890,7 +935,6 @@
       <w:pPr>
         <w:pStyle w:val="ListBullet"/>
         <w:spacing w:after="70" w:line="276" w:lineRule="auto"/>
-        <w:jc w:val="right"/>
         <w:bidi/>
       </w:pPr>
       <w:r>
@@ -905,7 +949,6 @@
       <w:pPr>
         <w:pStyle w:val="ListBullet"/>
         <w:spacing w:after="70" w:line="276" w:lineRule="auto"/>
-        <w:jc w:val="right"/>
         <w:bidi/>
       </w:pPr>
       <w:r>
@@ -920,7 +963,6 @@
       <w:pPr>
         <w:pStyle w:val="ListBullet"/>
         <w:spacing w:after="70" w:line="276" w:lineRule="auto"/>
-        <w:jc w:val="right"/>
         <w:bidi/>
       </w:pPr>
       <w:r>
@@ -935,7 +977,6 @@
       <w:pPr>
         <w:pStyle w:val="ListBullet"/>
         <w:spacing w:after="70" w:line="276" w:lineRule="auto"/>
-        <w:jc w:val="right"/>
         <w:bidi/>
       </w:pPr>
       <w:r>
@@ -949,7 +990,6 @@
     <w:p>
       <w:pPr>
         <w:spacing w:before="160" w:after="80"/>
-        <w:jc w:val="right"/>
         <w:bidi/>
       </w:pPr>
       <w:r>
@@ -966,7 +1006,6 @@
       <w:pPr>
         <w:pStyle w:val="ListBullet"/>
         <w:spacing w:after="70" w:line="276" w:lineRule="auto"/>
-        <w:jc w:val="right"/>
         <w:bidi/>
       </w:pPr>
       <w:r>
@@ -981,7 +1020,6 @@
       <w:pPr>
         <w:pStyle w:val="ListBullet"/>
         <w:spacing w:after="70" w:line="276" w:lineRule="auto"/>
-        <w:jc w:val="right"/>
         <w:bidi/>
       </w:pPr>
       <w:r>
@@ -996,7 +1034,6 @@
       <w:pPr>
         <w:pStyle w:val="ListBullet"/>
         <w:spacing w:after="70" w:line="276" w:lineRule="auto"/>
-        <w:jc w:val="right"/>
         <w:bidi/>
       </w:pPr>
       <w:r>
@@ -1011,7 +1048,6 @@
       <w:pPr>
         <w:pStyle w:val="ListBullet"/>
         <w:spacing w:after="70" w:line="276" w:lineRule="auto"/>
-        <w:jc w:val="right"/>
         <w:bidi/>
       </w:pPr>
       <w:r>
@@ -1026,7 +1062,6 @@
       <w:pPr>
         <w:pStyle w:val="ListBullet"/>
         <w:spacing w:after="70" w:line="276" w:lineRule="auto"/>
-        <w:jc w:val="right"/>
         <w:bidi/>
       </w:pPr>
       <w:r>
@@ -1041,7 +1076,6 @@
       <w:pPr>
         <w:pStyle w:val="ListBullet"/>
         <w:spacing w:after="70" w:line="276" w:lineRule="auto"/>
-        <w:jc w:val="right"/>
         <w:bidi/>
       </w:pPr>
       <w:r>
@@ -1055,7 +1089,6 @@
     <w:p>
       <w:pPr>
         <w:spacing w:before="160" w:after="80"/>
-        <w:jc w:val="right"/>
         <w:bidi/>
       </w:pPr>
       <w:r>
@@ -1072,7 +1105,6 @@
       <w:pPr>
         <w:pStyle w:val="ListBullet"/>
         <w:spacing w:after="70" w:line="276" w:lineRule="auto"/>
-        <w:jc w:val="right"/>
         <w:bidi/>
       </w:pPr>
       <w:r>
@@ -1087,7 +1119,6 @@
       <w:pPr>
         <w:pStyle w:val="ListBullet"/>
         <w:spacing w:after="70" w:line="276" w:lineRule="auto"/>
-        <w:jc w:val="right"/>
         <w:bidi/>
       </w:pPr>
       <w:r>
@@ -1102,7 +1133,6 @@
       <w:pPr>
         <w:pStyle w:val="ListBullet"/>
         <w:spacing w:after="70" w:line="276" w:lineRule="auto"/>
-        <w:jc w:val="right"/>
         <w:bidi/>
       </w:pPr>
       <w:r>
@@ -1117,7 +1147,6 @@
       <w:pPr>
         <w:pStyle w:val="ListBullet"/>
         <w:spacing w:after="70" w:line="276" w:lineRule="auto"/>
-        <w:jc w:val="right"/>
         <w:bidi/>
       </w:pPr>
       <w:r>
@@ -1131,7 +1160,6 @@
     <w:p>
       <w:pPr>
         <w:spacing w:before="160" w:after="80"/>
-        <w:jc w:val="right"/>
         <w:bidi/>
       </w:pPr>
       <w:r>
@@ -1147,7 +1175,6 @@
     <w:p>
       <w:pPr>
         <w:spacing w:after="70" w:line="276" w:lineRule="auto"/>
-        <w:jc w:val="right"/>
         <w:bidi/>
       </w:pPr>
       <w:r>
@@ -1162,7 +1189,6 @@
       <w:pPr>
         <w:pStyle w:val="ListNumber"/>
         <w:spacing w:after="70" w:line="276" w:lineRule="auto"/>
-        <w:jc w:val="right"/>
         <w:bidi/>
       </w:pPr>
       <w:r>
@@ -1177,7 +1203,6 @@
       <w:pPr>
         <w:pStyle w:val="ListNumber"/>
         <w:spacing w:after="70" w:line="276" w:lineRule="auto"/>
-        <w:jc w:val="right"/>
         <w:bidi/>
       </w:pPr>
       <w:r>
@@ -1192,7 +1217,6 @@
       <w:pPr>
         <w:pStyle w:val="ListNumber"/>
         <w:spacing w:after="70" w:line="276" w:lineRule="auto"/>
-        <w:jc w:val="right"/>
         <w:bidi/>
       </w:pPr>
       <w:r>
@@ -1207,7 +1231,6 @@
       <w:pPr>
         <w:pStyle w:val="ListNumber"/>
         <w:spacing w:after="70" w:line="276" w:lineRule="auto"/>
-        <w:jc w:val="right"/>
         <w:bidi/>
       </w:pPr>
       <w:r>
@@ -1222,7 +1245,6 @@
       <w:pPr>
         <w:pStyle w:val="ListNumber"/>
         <w:spacing w:after="70" w:line="276" w:lineRule="auto"/>
-        <w:jc w:val="right"/>
         <w:bidi/>
       </w:pPr>
       <w:r>
@@ -1237,7 +1259,6 @@
       <w:pPr>
         <w:pStyle w:val="ListNumber"/>
         <w:spacing w:after="70" w:line="276" w:lineRule="auto"/>
-        <w:jc w:val="right"/>
         <w:bidi/>
       </w:pPr>
       <w:r>
@@ -1251,7 +1272,6 @@
     <w:p>
       <w:pPr>
         <w:spacing w:after="70" w:line="276" w:lineRule="auto"/>
-        <w:jc w:val="right"/>
         <w:bidi/>
       </w:pPr>
       <w:r>
@@ -1266,7 +1286,6 @@
       <w:pPr>
         <w:pStyle w:val="ListBullet"/>
         <w:spacing w:after="70" w:line="276" w:lineRule="auto"/>
-        <w:jc w:val="right"/>
         <w:bidi/>
       </w:pPr>
       <w:r>
@@ -1281,7 +1300,6 @@
       <w:pPr>
         <w:pStyle w:val="ListBullet"/>
         <w:spacing w:after="70" w:line="276" w:lineRule="auto"/>
-        <w:jc w:val="right"/>
         <w:bidi/>
       </w:pPr>
       <w:r>
@@ -1296,7 +1314,6 @@
       <w:pPr>
         <w:pStyle w:val="ListBullet"/>
         <w:spacing w:after="70" w:line="276" w:lineRule="auto"/>
-        <w:jc w:val="right"/>
         <w:bidi/>
       </w:pPr>
       <w:r>
@@ -1311,7 +1328,6 @@
       <w:pPr>
         <w:pStyle w:val="ListBullet"/>
         <w:spacing w:after="70" w:line="276" w:lineRule="auto"/>
-        <w:jc w:val="right"/>
         <w:bidi/>
       </w:pPr>
       <w:r>
@@ -1326,7 +1342,6 @@
       <w:pPr>
         <w:pStyle w:val="ListBullet"/>
         <w:spacing w:after="70" w:line="276" w:lineRule="auto"/>
-        <w:jc w:val="right"/>
         <w:bidi/>
       </w:pPr>
       <w:r>
@@ -1341,7 +1356,6 @@
       <w:pPr>
         <w:pStyle w:val="ListBullet"/>
         <w:spacing w:after="70" w:line="276" w:lineRule="auto"/>
-        <w:jc w:val="right"/>
         <w:bidi/>
       </w:pPr>
       <w:r>
@@ -1356,7 +1370,6 @@
       <w:pPr>
         <w:pStyle w:val="ListBullet"/>
         <w:spacing w:after="70" w:line="276" w:lineRule="auto"/>
-        <w:jc w:val="right"/>
         <w:bidi/>
       </w:pPr>
       <w:r>
@@ -1371,7 +1384,6 @@
       <w:pPr>
         <w:pStyle w:val="ListBullet"/>
         <w:spacing w:after="70" w:line="276" w:lineRule="auto"/>
-        <w:jc w:val="right"/>
         <w:bidi/>
       </w:pPr>
       <w:r>
@@ -1386,7 +1398,6 @@
       <w:pPr>
         <w:pStyle w:val="ListBullet"/>
         <w:spacing w:after="70" w:line="276" w:lineRule="auto"/>
-        <w:jc w:val="right"/>
         <w:bidi/>
       </w:pPr>
       <w:r>
@@ -1400,7 +1411,6 @@
     <w:p>
       <w:pPr>
         <w:spacing w:after="70" w:line="276" w:lineRule="auto"/>
-        <w:jc w:val="right"/>
         <w:bidi/>
       </w:pPr>
       <w:r>
@@ -1415,7 +1425,6 @@
       <w:pPr>
         <w:pStyle w:val="ListBullet"/>
         <w:spacing w:after="70" w:line="276" w:lineRule="auto"/>
-        <w:jc w:val="right"/>
         <w:bidi/>
       </w:pPr>
       <w:r>
@@ -1430,7 +1439,6 @@
       <w:pPr>
         <w:pStyle w:val="ListBullet"/>
         <w:spacing w:after="70" w:line="276" w:lineRule="auto"/>
-        <w:jc w:val="right"/>
         <w:bidi/>
       </w:pPr>
       <w:r>
@@ -1445,7 +1453,6 @@
       <w:pPr>
         <w:pStyle w:val="ListBullet"/>
         <w:spacing w:after="70" w:line="276" w:lineRule="auto"/>
-        <w:jc w:val="right"/>
         <w:bidi/>
       </w:pPr>
       <w:r>
@@ -1459,7 +1466,6 @@
     <w:p>
       <w:pPr>
         <w:spacing w:before="160" w:after="80"/>
-        <w:jc w:val="right"/>
         <w:bidi/>
       </w:pPr>
       <w:r>
@@ -1476,7 +1482,6 @@
       <w:pPr>
         <w:pStyle w:val="ListBullet"/>
         <w:spacing w:after="70" w:line="276" w:lineRule="auto"/>
-        <w:jc w:val="right"/>
         <w:bidi/>
       </w:pPr>
       <w:r>
@@ -1491,7 +1496,6 @@
       <w:pPr>
         <w:pStyle w:val="ListBullet"/>
         <w:spacing w:after="70" w:line="276" w:lineRule="auto"/>
-        <w:jc w:val="right"/>
         <w:bidi/>
       </w:pPr>
       <w:r>
@@ -1506,7 +1510,6 @@
       <w:pPr>
         <w:pStyle w:val="ListBullet"/>
         <w:spacing w:after="70" w:line="276" w:lineRule="auto"/>
-        <w:jc w:val="right"/>
         <w:bidi/>
       </w:pPr>
       <w:r>
@@ -1521,7 +1524,6 @@
       <w:pPr>
         <w:pStyle w:val="ListBullet"/>
         <w:spacing w:after="70" w:line="276" w:lineRule="auto"/>
-        <w:jc w:val="right"/>
         <w:bidi/>
       </w:pPr>
       <w:r>
@@ -1536,7 +1538,6 @@
       <w:pPr>
         <w:pStyle w:val="ListBullet"/>
         <w:spacing w:after="70" w:line="276" w:lineRule="auto"/>
-        <w:jc w:val="right"/>
         <w:bidi/>
       </w:pPr>
       <w:r>
@@ -1551,7 +1552,6 @@
       <w:pPr>
         <w:pStyle w:val="ListBullet"/>
         <w:spacing w:after="70" w:line="276" w:lineRule="auto"/>
-        <w:jc w:val="right"/>
         <w:bidi/>
       </w:pPr>
       <w:r>
@@ -1565,7 +1565,6 @@
     <w:p>
       <w:pPr>
         <w:spacing w:before="160" w:after="80"/>
-        <w:jc w:val="right"/>
         <w:bidi/>
       </w:pPr>
       <w:r>
@@ -1582,7 +1581,6 @@
       <w:pPr>
         <w:pStyle w:val="ListBullet"/>
         <w:spacing w:after="70" w:line="276" w:lineRule="auto"/>
-        <w:jc w:val="right"/>
         <w:bidi/>
       </w:pPr>
       <w:r>
@@ -1597,7 +1595,6 @@
       <w:pPr>
         <w:pStyle w:val="ListBullet"/>
         <w:spacing w:after="70" w:line="276" w:lineRule="auto"/>
-        <w:jc w:val="right"/>
         <w:bidi/>
       </w:pPr>
       <w:r>
@@ -1612,7 +1609,6 @@
       <w:pPr>
         <w:pStyle w:val="ListBullet"/>
         <w:spacing w:after="70" w:line="276" w:lineRule="auto"/>
-        <w:jc w:val="right"/>
         <w:bidi/>
       </w:pPr>
       <w:r>
@@ -1627,7 +1623,6 @@
       <w:pPr>
         <w:pStyle w:val="ListBullet"/>
         <w:spacing w:after="70" w:line="276" w:lineRule="auto"/>
-        <w:jc w:val="right"/>
         <w:bidi/>
       </w:pPr>
       <w:r>
@@ -1642,7 +1637,6 @@
       <w:pPr>
         <w:pStyle w:val="ListBullet"/>
         <w:spacing w:after="70" w:line="276" w:lineRule="auto"/>
-        <w:jc w:val="right"/>
         <w:bidi/>
       </w:pPr>
       <w:r>
@@ -1657,7 +1651,6 @@
       <w:pPr>
         <w:pStyle w:val="ListBullet"/>
         <w:spacing w:after="70" w:line="276" w:lineRule="auto"/>
-        <w:jc w:val="right"/>
         <w:bidi/>
       </w:pPr>
       <w:r>
@@ -1672,7 +1665,6 @@
       <w:pPr>
         <w:pStyle w:val="ListBullet"/>
         <w:spacing w:after="70" w:line="276" w:lineRule="auto"/>
-        <w:jc w:val="right"/>
         <w:bidi/>
       </w:pPr>
       <w:r>
@@ -1686,7 +1678,6 @@
     <w:p>
       <w:pPr>
         <w:spacing w:after="70" w:line="276" w:lineRule="auto"/>
-        <w:jc w:val="right"/>
         <w:bidi/>
       </w:pPr>
       <w:r>
@@ -1700,7 +1691,6 @@
     <w:p>
       <w:pPr>
         <w:spacing w:before="160" w:after="80"/>
-        <w:jc w:val="right"/>
         <w:bidi/>
       </w:pPr>
       <w:r>
@@ -1717,7 +1707,6 @@
       <w:pPr>
         <w:pStyle w:val="ListBullet"/>
         <w:spacing w:after="70" w:line="276" w:lineRule="auto"/>
-        <w:jc w:val="right"/>
         <w:bidi/>
       </w:pPr>
       <w:r>
@@ -1732,7 +1721,6 @@
       <w:pPr>
         <w:pStyle w:val="ListBullet"/>
         <w:spacing w:after="70" w:line="276" w:lineRule="auto"/>
-        <w:jc w:val="right"/>
         <w:bidi/>
       </w:pPr>
       <w:r>
@@ -1747,7 +1735,6 @@
       <w:pPr>
         <w:pStyle w:val="ListBullet"/>
         <w:spacing w:after="70" w:line="276" w:lineRule="auto"/>
-        <w:jc w:val="right"/>
         <w:bidi/>
       </w:pPr>
       <w:r>
@@ -1762,7 +1749,6 @@
       <w:pPr>
         <w:pStyle w:val="ListBullet"/>
         <w:spacing w:after="70" w:line="276" w:lineRule="auto"/>
-        <w:jc w:val="right"/>
         <w:bidi/>
       </w:pPr>
       <w:r>
@@ -1776,7 +1762,6 @@
     <w:p>
       <w:pPr>
         <w:spacing w:before="160" w:after="80"/>
-        <w:jc w:val="right"/>
         <w:bidi/>
       </w:pPr>
       <w:r>
@@ -1793,7 +1778,6 @@
       <w:pPr>
         <w:pStyle w:val="ListBullet"/>
         <w:spacing w:after="70" w:line="276" w:lineRule="auto"/>
-        <w:jc w:val="right"/>
         <w:bidi/>
       </w:pPr>
       <w:r>
@@ -1808,7 +1792,6 @@
       <w:pPr>
         <w:pStyle w:val="ListBullet"/>
         <w:spacing w:after="70" w:line="276" w:lineRule="auto"/>
-        <w:jc w:val="right"/>
         <w:bidi/>
       </w:pPr>
       <w:r>
@@ -1823,7 +1806,6 @@
       <w:pPr>
         <w:pStyle w:val="ListBullet"/>
         <w:spacing w:after="70" w:line="276" w:lineRule="auto"/>
-        <w:jc w:val="right"/>
         <w:bidi/>
       </w:pPr>
       <w:r>
@@ -1838,7 +1820,6 @@
       <w:pPr>
         <w:pStyle w:val="ListBullet"/>
         <w:spacing w:after="70" w:line="276" w:lineRule="auto"/>
-        <w:jc w:val="right"/>
         <w:bidi/>
       </w:pPr>
       <w:r>
@@ -1853,7 +1834,6 @@
       <w:pPr>
         <w:pStyle w:val="ListBullet"/>
         <w:spacing w:after="70" w:line="276" w:lineRule="auto"/>
-        <w:jc w:val="right"/>
         <w:bidi/>
       </w:pPr>
       <w:r>
@@ -1868,7 +1848,6 @@
       <w:pPr>
         <w:pStyle w:val="ListBullet"/>
         <w:spacing w:after="70" w:line="276" w:lineRule="auto"/>
-        <w:jc w:val="right"/>
         <w:bidi/>
       </w:pPr>
       <w:r>
@@ -1883,7 +1862,6 @@
       <w:pPr>
         <w:pStyle w:val="ListBullet"/>
         <w:spacing w:after="70" w:line="276" w:lineRule="auto"/>
-        <w:jc w:val="right"/>
         <w:bidi/>
       </w:pPr>
       <w:r>
@@ -1897,7 +1875,6 @@
     <w:p>
       <w:pPr>
         <w:spacing w:before="160" w:after="80"/>
-        <w:jc w:val="right"/>
         <w:bidi/>
       </w:pPr>
       <w:r>
@@ -1914,7 +1891,6 @@
       <w:pPr>
         <w:pStyle w:val="ListBullet"/>
         <w:spacing w:after="70" w:line="276" w:lineRule="auto"/>
-        <w:jc w:val="right"/>
         <w:bidi/>
       </w:pPr>
       <w:r>
@@ -1929,7 +1905,6 @@
       <w:pPr>
         <w:pStyle w:val="ListBullet"/>
         <w:spacing w:after="70" w:line="276" w:lineRule="auto"/>
-        <w:jc w:val="right"/>
         <w:bidi/>
       </w:pPr>
       <w:r>
@@ -1944,7 +1919,6 @@
       <w:pPr>
         <w:pStyle w:val="ListBullet"/>
         <w:spacing w:after="70" w:line="276" w:lineRule="auto"/>
-        <w:jc w:val="right"/>
         <w:bidi/>
       </w:pPr>
       <w:r>
@@ -1959,7 +1933,6 @@
       <w:pPr>
         <w:pStyle w:val="ListBullet"/>
         <w:spacing w:after="70" w:line="276" w:lineRule="auto"/>
-        <w:jc w:val="right"/>
         <w:bidi/>
       </w:pPr>
       <w:r>
@@ -1974,7 +1947,6 @@
       <w:pPr>
         <w:pStyle w:val="ListBullet"/>
         <w:spacing w:after="70" w:line="276" w:lineRule="auto"/>
-        <w:jc w:val="right"/>
         <w:bidi/>
       </w:pPr>
       <w:r>
@@ -1989,7 +1961,6 @@
       <w:pPr>
         <w:pStyle w:val="ListBullet"/>
         <w:spacing w:after="70" w:line="276" w:lineRule="auto"/>
-        <w:jc w:val="right"/>
         <w:bidi/>
       </w:pPr>
       <w:r>
@@ -2004,7 +1975,6 @@
       <w:pPr>
         <w:pStyle w:val="ListBullet"/>
         <w:spacing w:after="70" w:line="276" w:lineRule="auto"/>
-        <w:jc w:val="right"/>
         <w:bidi/>
       </w:pPr>
       <w:r>
@@ -2019,7 +1989,6 @@
       <w:pPr>
         <w:pStyle w:val="ListBullet"/>
         <w:spacing w:after="70" w:line="276" w:lineRule="auto"/>
-        <w:jc w:val="right"/>
         <w:bidi/>
       </w:pPr>
       <w:r>
@@ -2034,7 +2003,6 @@
       <w:pPr>
         <w:pStyle w:val="ListBullet"/>
         <w:spacing w:after="70" w:line="276" w:lineRule="auto"/>
-        <w:jc w:val="right"/>
         <w:bidi/>
       </w:pPr>
       <w:r>
@@ -2049,7 +2017,6 @@
       <w:pPr>
         <w:pStyle w:val="ListBullet"/>
         <w:spacing w:after="70" w:line="276" w:lineRule="auto"/>
-        <w:jc w:val="right"/>
         <w:bidi/>
       </w:pPr>
       <w:r>
@@ -2063,7 +2030,6 @@
     <w:p>
       <w:pPr>
         <w:spacing w:before="160" w:after="80"/>
-        <w:jc w:val="right"/>
         <w:bidi/>
       </w:pPr>
       <w:r>
@@ -2080,7 +2046,6 @@
       <w:pPr>
         <w:pStyle w:val="ListBullet"/>
         <w:spacing w:after="70" w:line="276" w:lineRule="auto"/>
-        <w:jc w:val="right"/>
         <w:bidi/>
       </w:pPr>
       <w:r>
@@ -2095,7 +2060,6 @@
       <w:pPr>
         <w:pStyle w:val="ListBullet"/>
         <w:spacing w:after="70" w:line="276" w:lineRule="auto"/>
-        <w:jc w:val="right"/>
         <w:bidi/>
       </w:pPr>
       <w:r>
@@ -2110,7 +2074,6 @@
       <w:pPr>
         <w:pStyle w:val="ListBullet"/>
         <w:spacing w:after="70" w:line="276" w:lineRule="auto"/>
-        <w:jc w:val="right"/>
         <w:bidi/>
       </w:pPr>
       <w:r>
@@ -2125,7 +2088,6 @@
       <w:pPr>
         <w:pStyle w:val="ListBullet"/>
         <w:spacing w:after="70" w:line="276" w:lineRule="auto"/>
-        <w:jc w:val="right"/>
         <w:bidi/>
       </w:pPr>
       <w:r>
@@ -2140,7 +2102,6 @@
       <w:pPr>
         <w:pStyle w:val="ListBullet"/>
         <w:spacing w:after="70" w:line="276" w:lineRule="auto"/>
-        <w:jc w:val="right"/>
         <w:bidi/>
       </w:pPr>
       <w:r>
@@ -2154,7 +2115,6 @@
     <w:p>
       <w:pPr>
         <w:spacing w:before="160" w:after="80"/>
-        <w:jc w:val="right"/>
         <w:bidi/>
       </w:pPr>
       <w:r>
@@ -2171,7 +2131,6 @@
       <w:pPr>
         <w:pStyle w:val="ListBullet"/>
         <w:spacing w:after="70" w:line="276" w:lineRule="auto"/>
-        <w:jc w:val="right"/>
         <w:bidi/>
       </w:pPr>
       <w:r>
@@ -2186,7 +2145,6 @@
       <w:pPr>
         <w:pStyle w:val="ListBullet"/>
         <w:spacing w:after="70" w:line="276" w:lineRule="auto"/>
-        <w:jc w:val="right"/>
         <w:bidi/>
       </w:pPr>
       <w:r>
@@ -2201,7 +2159,6 @@
       <w:pPr>
         <w:pStyle w:val="ListBullet"/>
         <w:spacing w:after="70" w:line="276" w:lineRule="auto"/>
-        <w:jc w:val="right"/>
         <w:bidi/>
       </w:pPr>
       <w:r>
@@ -2216,7 +2173,6 @@
       <w:pPr>
         <w:pStyle w:val="ListBullet"/>
         <w:spacing w:after="70" w:line="276" w:lineRule="auto"/>
-        <w:jc w:val="right"/>
         <w:bidi/>
       </w:pPr>
       <w:r>
@@ -2231,7 +2187,6 @@
       <w:pPr>
         <w:pStyle w:val="ListBullet"/>
         <w:spacing w:after="70" w:line="276" w:lineRule="auto"/>
-        <w:jc w:val="right"/>
         <w:bidi/>
       </w:pPr>
       <w:r>
@@ -2246,7 +2201,6 @@
       <w:pPr>
         <w:pStyle w:val="ListBullet"/>
         <w:spacing w:after="70" w:line="276" w:lineRule="auto"/>
-        <w:jc w:val="right"/>
         <w:bidi/>
       </w:pPr>
       <w:r>
@@ -2261,7 +2215,6 @@
       <w:pPr>
         <w:pStyle w:val="ListBullet"/>
         <w:spacing w:after="70" w:line="276" w:lineRule="auto"/>
-        <w:jc w:val="right"/>
         <w:bidi/>
       </w:pPr>
       <w:r>
@@ -2276,7 +2229,6 @@
       <w:pPr>
         <w:pStyle w:val="ListBullet"/>
         <w:spacing w:after="70" w:line="276" w:lineRule="auto"/>
-        <w:jc w:val="right"/>
         <w:bidi/>
       </w:pPr>
       <w:r>
@@ -2291,7 +2243,6 @@
       <w:pPr>
         <w:pStyle w:val="ListBullet"/>
         <w:spacing w:after="70" w:line="276" w:lineRule="auto"/>
-        <w:jc w:val="right"/>
         <w:bidi/>
       </w:pPr>
       <w:r>
@@ -2305,7 +2256,6 @@
     <w:p>
       <w:pPr>
         <w:spacing w:before="160" w:after="80"/>
-        <w:jc w:val="right"/>
         <w:bidi/>
       </w:pPr>
       <w:r>
@@ -2322,7 +2272,6 @@
       <w:pPr>
         <w:pStyle w:val="ListBullet"/>
         <w:spacing w:after="70" w:line="276" w:lineRule="auto"/>
-        <w:jc w:val="right"/>
         <w:bidi/>
       </w:pPr>
       <w:r>
@@ -2337,7 +2286,6 @@
       <w:pPr>
         <w:pStyle w:val="ListBullet"/>
         <w:spacing w:after="70" w:line="276" w:lineRule="auto"/>
-        <w:jc w:val="right"/>
         <w:bidi/>
       </w:pPr>
       <w:r>
@@ -2352,7 +2300,6 @@
       <w:pPr>
         <w:pStyle w:val="ListBullet"/>
         <w:spacing w:after="70" w:line="276" w:lineRule="auto"/>
-        <w:jc w:val="right"/>
         <w:bidi/>
       </w:pPr>
       <w:r>
@@ -2367,7 +2314,6 @@
       <w:pPr>
         <w:pStyle w:val="ListBullet"/>
         <w:spacing w:after="70" w:line="276" w:lineRule="auto"/>
-        <w:jc w:val="right"/>
         <w:bidi/>
       </w:pPr>
       <w:r>
@@ -2381,7 +2327,6 @@
     <w:p>
       <w:pPr>
         <w:spacing w:before="160" w:after="80"/>
-        <w:jc w:val="right"/>
         <w:bidi/>
       </w:pPr>
       <w:r>
@@ -2397,7 +2342,6 @@
     <w:p>
       <w:pPr>
         <w:spacing w:after="70" w:line="276" w:lineRule="auto"/>
-        <w:jc w:val="right"/>
         <w:bidi/>
       </w:pPr>
       <w:r>
@@ -2650,7 +2594,7 @@
         <w:rFonts w:asciiTheme="minorHAnsi" w:eastAsiaTheme="minorEastAsia" w:hAnsiTheme="minorHAnsi" w:cstheme="minorBidi"/>
         <w:sz w:val="22"/>
         <w:szCs w:val="22"/>
-        <w:lang w:val="en-US" w:eastAsia="en-US" w:bidi="ar-SA"/>
+        <w:lang w:val="ar-SA" w:eastAsia="en-US" w:bidi="ar-SA"/>
       </w:rPr>
     </w:rPrDefault>
     <w:pPrDefault>
@@ -14500,7 +14444,7 @@
         <w:rFonts w:asciiTheme="minorHAnsi" w:eastAsiaTheme="minorEastAsia" w:hAnsiTheme="minorHAnsi" w:cstheme="minorBidi"/>
         <w:sz w:val="22"/>
         <w:szCs w:val="22"/>
-        <w:lang w:val="en-US" w:eastAsia="en-US" w:bidi="ar-SA"/>
+        <w:lang w:val="ar-SA" w:eastAsia="en-US" w:bidi="ar-SA"/>
       </w:rPr>
     </w:rPrDefault>
     <w:pPrDefault>

</xml_diff>